<commit_message>
Added dpdt relay support, configs, and arduino init
</commit_message>
<xml_diff>
--- a/Documentation/BiosigNULL Changelog.docx
+++ b/Documentation/BiosigNULL Changelog.docx
@@ -170,7 +170,6 @@
         <w:t xml:space="preserve">Turns on each port 1 by 1 with a 10 second pause </w:t>
       </w:r>
       <w:proofErr w:type="spellStart"/>
-      <w:proofErr w:type="gramStart"/>
       <w:r>
         <w:rPr>
           <w:sz w:val="24"/>
@@ -180,7 +179,6 @@
         <w:t>inbetween</w:t>
       </w:r>
       <w:proofErr w:type="spellEnd"/>
-      <w:proofErr w:type="gramEnd"/>
       <w:r>
         <w:rPr>
           <w:sz w:val="24"/>
@@ -359,41 +357,13 @@
         </w:rPr>
         <w:t xml:space="preserve">” tag which will allow selection of optimized voltages via excel sheet rather than manual entry. Shows the voltages and requires a Y/N confirmation before toggle. </w:t>
       </w:r>
-      <w:proofErr w:type="gramStart"/>
-      <w:r>
-        <w:rPr>
-          <w:sz w:val="24"/>
-          <w:szCs w:val="24"/>
-          <w:lang w:val="en-US"/>
-        </w:rPr>
-        <w:t>Voltage</w:t>
-      </w:r>
-      <w:proofErr w:type="gramEnd"/>
-      <w:r>
-        <w:rPr>
-          <w:sz w:val="24"/>
-          <w:szCs w:val="24"/>
-          <w:lang w:val="en-US"/>
-        </w:rPr>
-        <w:t xml:space="preserve"> </w:t>
-      </w:r>
-      <w:proofErr w:type="gramStart"/>
-      <w:r>
-        <w:rPr>
-          <w:sz w:val="24"/>
-          <w:szCs w:val="24"/>
-          <w:lang w:val="en-US"/>
-        </w:rPr>
-        <w:t>are</w:t>
-      </w:r>
-      <w:proofErr w:type="gramEnd"/>
-      <w:r>
-        <w:rPr>
-          <w:sz w:val="24"/>
-          <w:szCs w:val="24"/>
-          <w:lang w:val="en-US"/>
-        </w:rPr>
-        <w:t xml:space="preserve"> rounded to two decimal places in selection.</w:t>
+      <w:r>
+        <w:rPr>
+          <w:sz w:val="24"/>
+          <w:szCs w:val="24"/>
+          <w:lang w:val="en-US"/>
+        </w:rPr>
+        <w:t>Voltage are rounded to two decimal places in selection.</w:t>
       </w:r>
     </w:p>
     <w:p>
@@ -559,14 +529,188 @@
     </w:p>
     <w:p>
       <w:pPr>
-        <w:rPr>
-          <w:b/>
-          <w:bCs/>
-          <w:sz w:val="24"/>
-          <w:szCs w:val="24"/>
-          <w:lang w:val="en-US"/>
-        </w:rPr>
-      </w:pPr>
+        <w:pBdr>
+          <w:bottom w:val="single" w:sz="6" w:space="1" w:color="auto"/>
+        </w:pBdr>
+        <w:rPr>
+          <w:b/>
+          <w:bCs/>
+          <w:sz w:val="28"/>
+          <w:szCs w:val="28"/>
+          <w:lang w:val="en-US"/>
+        </w:rPr>
+      </w:pPr>
+      <w:r>
+        <w:rPr>
+          <w:b/>
+          <w:bCs/>
+          <w:sz w:val="28"/>
+          <w:szCs w:val="28"/>
+          <w:lang w:val="en-US"/>
+        </w:rPr>
+        <w:t>V2.0:</w:t>
+      </w:r>
+    </w:p>
+    <w:p>
+      <w:pPr>
+        <w:rPr>
+          <w:b/>
+          <w:bCs/>
+          <w:sz w:val="24"/>
+          <w:szCs w:val="24"/>
+          <w:lang w:val="en-US"/>
+        </w:rPr>
+      </w:pPr>
+      <w:r>
+        <w:rPr>
+          <w:b/>
+          <w:bCs/>
+          <w:sz w:val="24"/>
+          <w:szCs w:val="24"/>
+          <w:lang w:val="en-US"/>
+        </w:rPr>
+        <w:t>Additions:</w:t>
+      </w:r>
+    </w:p>
+    <w:p>
+      <w:pPr>
+        <w:pStyle w:val="ListParagraph"/>
+        <w:numPr>
+          <w:ilvl w:val="0"/>
+          <w:numId w:val="3"/>
+        </w:numPr>
+        <w:rPr>
+          <w:b/>
+          <w:bCs/>
+          <w:sz w:val="24"/>
+          <w:szCs w:val="24"/>
+          <w:lang w:val="en-US"/>
+        </w:rPr>
+      </w:pPr>
+      <w:r>
+        <w:rPr>
+          <w:b/>
+          <w:bCs/>
+          <w:sz w:val="24"/>
+          <w:szCs w:val="24"/>
+          <w:lang w:val="en-US"/>
+        </w:rPr>
+        <w:t>Added functionality for DPDT Relays.</w:t>
+      </w:r>
+    </w:p>
+    <w:p>
+      <w:pPr>
+        <w:pStyle w:val="ListParagraph"/>
+        <w:numPr>
+          <w:ilvl w:val="0"/>
+          <w:numId w:val="3"/>
+        </w:numPr>
+        <w:rPr>
+          <w:b/>
+          <w:bCs/>
+          <w:sz w:val="24"/>
+          <w:szCs w:val="24"/>
+          <w:lang w:val="en-US"/>
+        </w:rPr>
+      </w:pPr>
+      <w:r>
+        <w:rPr>
+          <w:b/>
+          <w:bCs/>
+          <w:sz w:val="24"/>
+          <w:szCs w:val="24"/>
+          <w:lang w:val="en-US"/>
+        </w:rPr>
+        <w:t xml:space="preserve">Initialize_arduino.py: </w:t>
+      </w:r>
+      <w:r>
+        <w:rPr>
+          <w:sz w:val="24"/>
+          <w:szCs w:val="24"/>
+          <w:lang w:val="en-US"/>
+        </w:rPr>
+        <w:t>.</w:t>
+      </w:r>
+      <w:proofErr w:type="spellStart"/>
+      <w:r>
+        <w:rPr>
+          <w:sz w:val="24"/>
+          <w:szCs w:val="24"/>
+          <w:lang w:val="en-US"/>
+        </w:rPr>
+        <w:t>ino</w:t>
+      </w:r>
+      <w:proofErr w:type="spellEnd"/>
+      <w:r>
+        <w:rPr>
+          <w:sz w:val="24"/>
+          <w:szCs w:val="24"/>
+          <w:lang w:val="en-US"/>
+        </w:rPr>
+        <w:t xml:space="preserve"> file that allows communication via </w:t>
+      </w:r>
+      <w:proofErr w:type="spellStart"/>
+      <w:r>
+        <w:rPr>
+          <w:sz w:val="24"/>
+          <w:szCs w:val="24"/>
+          <w:lang w:val="en-US"/>
+        </w:rPr>
+        <w:t>Pyfirmata</w:t>
+      </w:r>
+      <w:proofErr w:type="spellEnd"/>
+      <w:r>
+        <w:rPr>
+          <w:sz w:val="24"/>
+          <w:szCs w:val="24"/>
+          <w:lang w:val="en-US"/>
+        </w:rPr>
+        <w:t xml:space="preserve"> with Arduino MEGA. Run once on Mega. Copy of </w:t>
+      </w:r>
+      <w:proofErr w:type="spellStart"/>
+      <w:r>
+        <w:rPr>
+          <w:sz w:val="24"/>
+          <w:szCs w:val="24"/>
+          <w:lang w:val="en-US"/>
+        </w:rPr>
+        <w:t>StandardFirmata</w:t>
+      </w:r>
+      <w:proofErr w:type="spellEnd"/>
+      <w:r>
+        <w:rPr>
+          <w:sz w:val="24"/>
+          <w:szCs w:val="24"/>
+          <w:lang w:val="en-US"/>
+        </w:rPr>
+        <w:t xml:space="preserve">. </w:t>
+      </w:r>
+    </w:p>
+    <w:p>
+      <w:pPr>
+        <w:pStyle w:val="ListParagraph"/>
+        <w:numPr>
+          <w:ilvl w:val="0"/>
+          <w:numId w:val="3"/>
+        </w:numPr>
+        <w:rPr>
+          <w:b/>
+          <w:bCs/>
+          <w:sz w:val="24"/>
+          <w:szCs w:val="24"/>
+          <w:lang w:val="en-US"/>
+        </w:rPr>
+      </w:pPr>
+      <w:r>
+        <w:rPr>
+          <w:b/>
+          <w:bCs/>
+          <w:sz w:val="24"/>
+          <w:szCs w:val="24"/>
+          <w:lang w:val="en-US"/>
+        </w:rPr>
+        <w:t>Flip_single_relay.py</w:t>
+      </w:r>
     </w:p>
     <w:sectPr>
       <w:pgSz w:w="12240" w:h="15840"/>
@@ -581,6 +725,119 @@
 <file path=word/numbering.xml><?xml version="1.0" encoding="utf-8"?>
 <w:numbering xmlns:wpc="http://schemas.microsoft.com/office/word/2010/wordprocessingCanvas" xmlns:cx="http://schemas.microsoft.com/office/drawing/2014/chartex" xmlns:cx1="http://schemas.microsoft.com/office/drawing/2015/9/8/chartex" xmlns:cx2="http://schemas.microsoft.com/office/drawing/2015/10/21/chartex" xmlns:cx3="http://schemas.microsoft.com/office/drawing/2016/5/9/chartex" xmlns:cx4="http://schemas.microsoft.com/office/drawing/2016/5/10/chartex" xmlns:cx5="http://schemas.microsoft.com/office/drawing/2016/5/11/chartex" xmlns:cx6="http://schemas.microsoft.com/office/drawing/2016/5/12/chartex" xmlns:cx7="http://schemas.microsoft.com/office/drawing/2016/5/13/chartex" xmlns:cx8="http://schemas.microsoft.com/office/drawing/2016/5/14/chartex" xmlns:mc="http://schemas.openxmlformats.org/markup-compatibility/2006" xmlns:aink="http://schemas.microsoft.com/office/drawing/2016/ink" xmlns:am3d="http://schemas.microsoft.com/office/drawing/2017/model3d" xmlns:o="urn:schemas-microsoft-com:office:office" xmlns:oel="http://schemas.microsoft.com/office/2019/extlst" xmlns:r="http://schemas.openxmlformats.org/officeDocument/2006/relationships" xmlns:m="http://schemas.openxmlformats.org/officeDocument/2006/math" xmlns:v="urn:schemas-microsoft-com:vml" xmlns:wp14="http://schemas.microsoft.com/office/word/2010/wordprocessingDrawing" xmlns:wp="http://schemas.openxmlformats.org/drawingml/2006/wordprocessingDrawing" xmlns:w10="urn:schemas-microsoft-com:office:word" xmlns:w="http://schemas.openxmlformats.org/wordprocessingml/2006/main" xmlns:w14="http://schemas.microsoft.com/office/word/2010/wordml" xmlns:w15="http://schemas.microsoft.com/office/word/2012/wordml" xmlns:w16cex="http://schemas.microsoft.com/office/word/2018/wordml/cex" xmlns:w16cid="http://schemas.microsoft.com/office/word/2016/wordml/cid" xmlns:w16="http://schemas.microsoft.com/office/word/2018/wordml" xmlns:w16du="http://schemas.microsoft.com/office/word/2023/wordml/word16du" xmlns:w16sdtdh="http://schemas.microsoft.com/office/word/2020/wordml/sdtdatahash" xmlns:w16sdtfl="http://schemas.microsoft.com/office/word/2024/wordml/sdtformatlock" xmlns:w16se="http://schemas.microsoft.com/office/word/2015/wordml/symex" xmlns:wpg="http://schemas.microsoft.com/office/word/2010/wordprocessingGroup" xmlns:wpi="http://schemas.microsoft.com/office/word/2010/wordprocessingInk" xmlns:wne="http://schemas.microsoft.com/office/word/2006/wordml" xmlns:wps="http://schemas.microsoft.com/office/word/2010/wordprocessingShape" mc:Ignorable="w14 w15 w16se w16cid w16 w16cex w16sdtdh w16sdtfl w16du wp14">
   <w:abstractNum w:abstractNumId="0" w15:restartNumberingAfterBreak="0">
+    <w:nsid w:val="01141550"/>
+    <w:multiLevelType w:val="hybridMultilevel"/>
+    <w:tmpl w:val="ABF8CD82"/>
+    <w:lvl w:ilvl="0" w:tplc="10090001">
+      <w:start w:val="1"/>
+      <w:numFmt w:val="bullet"/>
+      <w:lvlText w:val=""/>
+      <w:lvlJc w:val="left"/>
+      <w:pPr>
+        <w:ind w:left="720" w:hanging="360"/>
+      </w:pPr>
+      <w:rPr>
+        <w:rFonts w:ascii="Symbol" w:hAnsi="Symbol" w:hint="default"/>
+      </w:rPr>
+    </w:lvl>
+    <w:lvl w:ilvl="1" w:tplc="10090003" w:tentative="1">
+      <w:start w:val="1"/>
+      <w:numFmt w:val="bullet"/>
+      <w:lvlText w:val="o"/>
+      <w:lvlJc w:val="left"/>
+      <w:pPr>
+        <w:ind w:left="1440" w:hanging="360"/>
+      </w:pPr>
+      <w:rPr>
+        <w:rFonts w:ascii="Courier New" w:hAnsi="Courier New" w:cs="Courier New" w:hint="default"/>
+      </w:rPr>
+    </w:lvl>
+    <w:lvl w:ilvl="2" w:tplc="10090005" w:tentative="1">
+      <w:start w:val="1"/>
+      <w:numFmt w:val="bullet"/>
+      <w:lvlText w:val=""/>
+      <w:lvlJc w:val="left"/>
+      <w:pPr>
+        <w:ind w:left="2160" w:hanging="360"/>
+      </w:pPr>
+      <w:rPr>
+        <w:rFonts w:ascii="Wingdings" w:hAnsi="Wingdings" w:hint="default"/>
+      </w:rPr>
+    </w:lvl>
+    <w:lvl w:ilvl="3" w:tplc="10090001" w:tentative="1">
+      <w:start w:val="1"/>
+      <w:numFmt w:val="bullet"/>
+      <w:lvlText w:val=""/>
+      <w:lvlJc w:val="left"/>
+      <w:pPr>
+        <w:ind w:left="2880" w:hanging="360"/>
+      </w:pPr>
+      <w:rPr>
+        <w:rFonts w:ascii="Symbol" w:hAnsi="Symbol" w:hint="default"/>
+      </w:rPr>
+    </w:lvl>
+    <w:lvl w:ilvl="4" w:tplc="10090003" w:tentative="1">
+      <w:start w:val="1"/>
+      <w:numFmt w:val="bullet"/>
+      <w:lvlText w:val="o"/>
+      <w:lvlJc w:val="left"/>
+      <w:pPr>
+        <w:ind w:left="3600" w:hanging="360"/>
+      </w:pPr>
+      <w:rPr>
+        <w:rFonts w:ascii="Courier New" w:hAnsi="Courier New" w:cs="Courier New" w:hint="default"/>
+      </w:rPr>
+    </w:lvl>
+    <w:lvl w:ilvl="5" w:tplc="10090005" w:tentative="1">
+      <w:start w:val="1"/>
+      <w:numFmt w:val="bullet"/>
+      <w:lvlText w:val=""/>
+      <w:lvlJc w:val="left"/>
+      <w:pPr>
+        <w:ind w:left="4320" w:hanging="360"/>
+      </w:pPr>
+      <w:rPr>
+        <w:rFonts w:ascii="Wingdings" w:hAnsi="Wingdings" w:hint="default"/>
+      </w:rPr>
+    </w:lvl>
+    <w:lvl w:ilvl="6" w:tplc="10090001" w:tentative="1">
+      <w:start w:val="1"/>
+      <w:numFmt w:val="bullet"/>
+      <w:lvlText w:val=""/>
+      <w:lvlJc w:val="left"/>
+      <w:pPr>
+        <w:ind w:left="5040" w:hanging="360"/>
+      </w:pPr>
+      <w:rPr>
+        <w:rFonts w:ascii="Symbol" w:hAnsi="Symbol" w:hint="default"/>
+      </w:rPr>
+    </w:lvl>
+    <w:lvl w:ilvl="7" w:tplc="10090003" w:tentative="1">
+      <w:start w:val="1"/>
+      <w:numFmt w:val="bullet"/>
+      <w:lvlText w:val="o"/>
+      <w:lvlJc w:val="left"/>
+      <w:pPr>
+        <w:ind w:left="5760" w:hanging="360"/>
+      </w:pPr>
+      <w:rPr>
+        <w:rFonts w:ascii="Courier New" w:hAnsi="Courier New" w:cs="Courier New" w:hint="default"/>
+      </w:rPr>
+    </w:lvl>
+    <w:lvl w:ilvl="8" w:tplc="10090005" w:tentative="1">
+      <w:start w:val="1"/>
+      <w:numFmt w:val="bullet"/>
+      <w:lvlText w:val=""/>
+      <w:lvlJc w:val="left"/>
+      <w:pPr>
+        <w:ind w:left="6480" w:hanging="360"/>
+      </w:pPr>
+      <w:rPr>
+        <w:rFonts w:ascii="Wingdings" w:hAnsi="Wingdings" w:hint="default"/>
+      </w:rPr>
+    </w:lvl>
+  </w:abstractNum>
+  <w:abstractNum w:abstractNumId="1" w15:restartNumberingAfterBreak="0">
     <w:nsid w:val="42D64605"/>
     <w:multiLevelType w:val="hybridMultilevel"/>
     <w:tmpl w:val="D6D0857C"/>
@@ -693,7 +950,7 @@
       </w:rPr>
     </w:lvl>
   </w:abstractNum>
-  <w:abstractNum w:abstractNumId="1" w15:restartNumberingAfterBreak="0">
+  <w:abstractNum w:abstractNumId="2" w15:restartNumberingAfterBreak="0">
     <w:nsid w:val="63A74B0C"/>
     <w:multiLevelType w:val="hybridMultilevel"/>
     <w:tmpl w:val="C33EC8CA"/>
@@ -807,9 +1064,12 @@
     </w:lvl>
   </w:abstractNum>
   <w:num w:numId="1" w16cid:durableId="1485704104">
+    <w:abstractNumId w:val="2"/>
+  </w:num>
+  <w:num w:numId="2" w16cid:durableId="170072974">
     <w:abstractNumId w:val="1"/>
   </w:num>
-  <w:num w:numId="2" w16cid:durableId="170072974">
+  <w:num w:numId="3" w16cid:durableId="806053057">
     <w:abstractNumId w:val="0"/>
   </w:num>
 </w:numbering>
@@ -2262,20 +2522,20 @@
 </file>
 
 <file path=customXml/item2.xml><?xml version="1.0" encoding="utf-8"?>
+<p:properties xmlns:p="http://schemas.microsoft.com/office/2006/metadata/properties" xmlns:xsi="http://www.w3.org/2001/XMLSchema-instance" xmlns:pc="http://schemas.microsoft.com/office/infopath/2007/PartnerControls">
+  <documentManagement>
+    <_activity xmlns="cad9c3cd-85c0-465f-91b3-4f31e8f620b7" xsi:nil="true"/>
+  </documentManagement>
+</p:properties>
+</file>
+
+<file path=customXml/item3.xml><?xml version="1.0" encoding="utf-8"?>
 <?mso-contentType ?>
 <FormTemplates xmlns="http://schemas.microsoft.com/sharepoint/v3/contenttype/forms">
   <Display>DocumentLibraryForm</Display>
   <Edit>DocumentLibraryForm</Edit>
   <New>DocumentLibraryForm</New>
 </FormTemplates>
-</file>
-
-<file path=customXml/item3.xml><?xml version="1.0" encoding="utf-8"?>
-<p:properties xmlns:p="http://schemas.microsoft.com/office/2006/metadata/properties" xmlns:xsi="http://www.w3.org/2001/XMLSchema-instance" xmlns:pc="http://schemas.microsoft.com/office/infopath/2007/PartnerControls">
-  <documentManagement>
-    <_activity xmlns="cad9c3cd-85c0-465f-91b3-4f31e8f620b7" xsi:nil="true"/>
-  </documentManagement>
-</p:properties>
 </file>
 
 <file path=customXml/itemProps1.xml><?xml version="1.0" encoding="utf-8"?>
@@ -2298,14 +2558,6 @@
 </file>
 
 <file path=customXml/itemProps2.xml><?xml version="1.0" encoding="utf-8"?>
-<ds:datastoreItem xmlns:ds="http://schemas.openxmlformats.org/officeDocument/2006/customXml" ds:itemID="{AB3B2F1D-436F-498E-9CC3-4DE3C3408D43}">
-  <ds:schemaRefs>
-    <ds:schemaRef ds:uri="http://schemas.microsoft.com/sharepoint/v3/contenttype/forms"/>
-  </ds:schemaRefs>
-</ds:datastoreItem>
-</file>
-
-<file path=customXml/itemProps3.xml><?xml version="1.0" encoding="utf-8"?>
 <ds:datastoreItem xmlns:ds="http://schemas.openxmlformats.org/officeDocument/2006/customXml" ds:itemID="{7B8E43E7-AEE1-41A6-8E02-3E850EF874D8}">
   <ds:schemaRefs>
     <ds:schemaRef ds:uri="http://schemas.microsoft.com/office/2006/metadata/properties"/>
@@ -2313,4 +2565,12 @@
     <ds:schemaRef ds:uri="cad9c3cd-85c0-465f-91b3-4f31e8f620b7"/>
   </ds:schemaRefs>
 </ds:datastoreItem>
+</file>
+
+<file path=customXml/itemProps3.xml><?xml version="1.0" encoding="utf-8"?>
+<ds:datastoreItem xmlns:ds="http://schemas.openxmlformats.org/officeDocument/2006/customXml" ds:itemID="{AB3B2F1D-436F-498E-9CC3-4DE3C3408D43}">
+  <ds:schemaRefs>
+    <ds:schemaRef ds:uri="http://schemas.microsoft.com/sharepoint/v3/contenttype/forms"/>
+  </ds:schemaRefs>
+</ds:datastoreItem>
 </file>
</xml_diff>